<commit_message>
Add report section V subcriteria detail and Word export.
List unchecked sub-items by current level rules and update the Word template columns.

Co-authored-by: Cursor <cursoragent@cursor.com>
</commit_message>
<xml_diff>
--- a/templates/bao-cao-ctcl.template.docx
+++ b/templates/bao-cao-ctcl.template.docx
@@ -1188,7 +1188,7 @@
           <w:sz w:val="26"/>
           <w:szCs w:val="26"/>
         </w:rPr>
-        <w:t xml:space="preserve">IV. DANH SÁCH TIÊU CHÍ DƯỚI MỨC 3</w:t>
+        <w:t xml:space="preserve">IV. DANH SÁCH CÁC TIÊU CHÍ DƯỚI MỨC 4</w:t>
       </w:r>
     </w:p>
     <w:tbl>
@@ -1365,7 +1365,7 @@
                 <w:sz w:val="26"/>
                 <w:szCs w:val="26"/>
               </w:rPr>
-              <w:t xml:space="preserve">{#belowLevel3}{stt}</w:t>
+              <w:t xml:space="preserve">{#belowLevel4}{stt}</w:t>
             </w:r>
           </w:p>
         </w:tc>
@@ -1475,7 +1475,7 @@
                 <w:sz w:val="26"/>
                 <w:szCs w:val="26"/>
               </w:rPr>
-              <w:t xml:space="preserve">{departmentName}{/belowLevel3}</w:t>
+              <w:t xml:space="preserve">{departmentName}{/belowLevel4}</w:t>
             </w:r>
           </w:p>
         </w:tc>
@@ -1500,6 +1500,21 @@
           <w:szCs w:val="26"/>
         </w:rPr>
         <w:t xml:space="preserve">V. CÁC TIÊU CHÍ CHƯA ĐẠT KẾ HOẠCH</w:t>
+      </w:r>
+    </w:p>
+    <w:p>
+      <w:pPr>
+        <w:spacing w:line="360" w:lineRule="auto"/>
+        <w:jc w:val="left"/>
+      </w:pPr>
+      <w:r>
+        <w:rPr>
+          <w:rFonts w:ascii="Times New Roman" w:cs="Times New Roman" w:eastAsia="Times New Roman" w:hAnsi="Times New Roman"/>
+          <w:color w:val="000000"/>
+          <w:sz w:val="26"/>
+          <w:szCs w:val="26"/>
+        </w:rPr>
+        <w:t xml:space="preserve">Chi tiết các tiểu mục chưa hoàn thành (cột Ghi chú để trống, người dùng tự nhập).</w:t>
       </w:r>
     </w:p>
     <w:tbl>
@@ -1516,55 +1531,78 @@
         <w:tblLayout w:type="fixed"/>
       </w:tblPr>
       <w:tblGrid>
-        <w:gridCol w:w="600"/>
-        <w:gridCol w:w="1100"/>
+        <w:gridCol w:w="900"/>
+        <w:gridCol w:w="900"/>
+        <w:gridCol w:w="900"/>
         <w:gridCol w:w="3600"/>
-        <w:gridCol w:w="1000"/>
-        <w:gridCol w:w="1000"/>
-        <w:gridCol w:w="2000"/>
+        <w:gridCol w:w="1200"/>
+        <w:gridCol w:w="1800"/>
+        <w:gridCol w:w="1200"/>
       </w:tblGrid>
       <w:tr>
         <w:tc>
           <w:tcPr>
-            <w:tcW w:type="dxa" w:w="600"/>
-          </w:tcPr>
-          <w:p>
-            <w:pPr>
-              <w:spacing w:line="360" w:lineRule="auto"/>
-              <w:jc w:val="left"/>
-            </w:pPr>
-            <w:r>
-              <w:rPr>
-                <w:rFonts w:ascii="Times New Roman" w:cs="Times New Roman" w:eastAsia="Times New Roman" w:hAnsi="Times New Roman"/>
-                <w:b/>
-                <w:bCs/>
-                <w:color w:val="000000"/>
-                <w:sz w:val="26"/>
-                <w:szCs w:val="26"/>
-              </w:rPr>
-              <w:t xml:space="preserve">STT</w:t>
-            </w:r>
-          </w:p>
-        </w:tc>
-        <w:tc>
-          <w:tcPr>
-            <w:tcW w:type="dxa" w:w="1100"/>
-          </w:tcPr>
-          <w:p>
-            <w:pPr>
-              <w:spacing w:line="360" w:lineRule="auto"/>
-              <w:jc w:val="left"/>
-            </w:pPr>
-            <w:r>
-              <w:rPr>
-                <w:rFonts w:ascii="Times New Roman" w:cs="Times New Roman" w:eastAsia="Times New Roman" w:hAnsi="Times New Roman"/>
-                <w:b/>
-                <w:bCs/>
-                <w:color w:val="000000"/>
-                <w:sz w:val="26"/>
-                <w:szCs w:val="26"/>
-              </w:rPr>
-              <w:t xml:space="preserve">Mã</w:t>
+            <w:tcW w:type="dxa" w:w="900"/>
+          </w:tcPr>
+          <w:p>
+            <w:pPr>
+              <w:spacing w:line="360" w:lineRule="auto"/>
+              <w:jc w:val="left"/>
+            </w:pPr>
+            <w:r>
+              <w:rPr>
+                <w:rFonts w:ascii="Times New Roman" w:cs="Times New Roman" w:eastAsia="Times New Roman" w:hAnsi="Times New Roman"/>
+                <w:b/>
+                <w:bCs/>
+                <w:color w:val="000000"/>
+                <w:sz w:val="26"/>
+                <w:szCs w:val="26"/>
+              </w:rPr>
+              <w:t xml:space="preserve">Mã TC</w:t>
+            </w:r>
+          </w:p>
+        </w:tc>
+        <w:tc>
+          <w:tcPr>
+            <w:tcW w:type="dxa" w:w="900"/>
+          </w:tcPr>
+          <w:p>
+            <w:pPr>
+              <w:spacing w:line="360" w:lineRule="auto"/>
+              <w:jc w:val="left"/>
+            </w:pPr>
+            <w:r>
+              <w:rPr>
+                <w:rFonts w:ascii="Times New Roman" w:cs="Times New Roman" w:eastAsia="Times New Roman" w:hAnsi="Times New Roman"/>
+                <w:b/>
+                <w:bCs/>
+                <w:color w:val="000000"/>
+                <w:sz w:val="26"/>
+                <w:szCs w:val="26"/>
+              </w:rPr>
+              <w:t xml:space="preserve">Mức đạt hiện tại</w:t>
+            </w:r>
+          </w:p>
+        </w:tc>
+        <w:tc>
+          <w:tcPr>
+            <w:tcW w:type="dxa" w:w="900"/>
+          </w:tcPr>
+          <w:p>
+            <w:pPr>
+              <w:spacing w:line="360" w:lineRule="auto"/>
+              <w:jc w:val="left"/>
+            </w:pPr>
+            <w:r>
+              <w:rPr>
+                <w:rFonts w:ascii="Times New Roman" w:cs="Times New Roman" w:eastAsia="Times New Roman" w:hAnsi="Times New Roman"/>
+                <w:b/>
+                <w:bCs/>
+                <w:color w:val="000000"/>
+                <w:sz w:val="26"/>
+                <w:szCs w:val="26"/>
+              </w:rPr>
+              <w:t xml:space="preserve">Mức dự kiến</w:t>
             </w:r>
           </w:p>
         </w:tc>
@@ -1586,73 +1624,73 @@
                 <w:sz w:val="26"/>
                 <w:szCs w:val="26"/>
               </w:rPr>
-              <w:t xml:space="preserve">Tên tiêu chí</w:t>
-            </w:r>
-          </w:p>
-        </w:tc>
-        <w:tc>
-          <w:tcPr>
-            <w:tcW w:type="dxa" w:w="1000"/>
-          </w:tcPr>
-          <w:p>
-            <w:pPr>
-              <w:spacing w:line="360" w:lineRule="auto"/>
-              <w:jc w:val="left"/>
-            </w:pPr>
-            <w:r>
-              <w:rPr>
-                <w:rFonts w:ascii="Times New Roman" w:cs="Times New Roman" w:eastAsia="Times New Roman" w:hAnsi="Times New Roman"/>
-                <w:b/>
-                <w:bCs/>
-                <w:color w:val="000000"/>
-                <w:sz w:val="26"/>
-                <w:szCs w:val="26"/>
-              </w:rPr>
-              <w:t xml:space="preserve">Mức đạt</w:t>
-            </w:r>
-          </w:p>
-        </w:tc>
-        <w:tc>
-          <w:tcPr>
-            <w:tcW w:type="dxa" w:w="1000"/>
-          </w:tcPr>
-          <w:p>
-            <w:pPr>
-              <w:spacing w:line="360" w:lineRule="auto"/>
-              <w:jc w:val="left"/>
-            </w:pPr>
-            <w:r>
-              <w:rPr>
-                <w:rFonts w:ascii="Times New Roman" w:cs="Times New Roman" w:eastAsia="Times New Roman" w:hAnsi="Times New Roman"/>
-                <w:b/>
-                <w:bCs/>
-                <w:color w:val="000000"/>
-                <w:sz w:val="26"/>
-                <w:szCs w:val="26"/>
-              </w:rPr>
-              <w:t xml:space="preserve">Kế hoạch</w:t>
-            </w:r>
-          </w:p>
-        </w:tc>
-        <w:tc>
-          <w:tcPr>
-            <w:tcW w:type="dxa" w:w="2000"/>
-          </w:tcPr>
-          <w:p>
-            <w:pPr>
-              <w:spacing w:line="360" w:lineRule="auto"/>
-              <w:jc w:val="left"/>
-            </w:pPr>
-            <w:r>
-              <w:rPr>
-                <w:rFonts w:ascii="Times New Roman" w:cs="Times New Roman" w:eastAsia="Times New Roman" w:hAnsi="Times New Roman"/>
-                <w:b/>
-                <w:bCs/>
-                <w:color w:val="000000"/>
-                <w:sz w:val="26"/>
-                <w:szCs w:val="26"/>
-              </w:rPr>
-              <w:t xml:space="preserve">Khoa/phòng</w:t>
+              <w:t xml:space="preserve">Tiểu mục chưa đạt</w:t>
+            </w:r>
+          </w:p>
+        </w:tc>
+        <w:tc>
+          <w:tcPr>
+            <w:tcW w:type="dxa" w:w="1200"/>
+          </w:tcPr>
+          <w:p>
+            <w:pPr>
+              <w:spacing w:line="360" w:lineRule="auto"/>
+              <w:jc w:val="left"/>
+            </w:pPr>
+            <w:r>
+              <w:rPr>
+                <w:rFonts w:ascii="Times New Roman" w:cs="Times New Roman" w:eastAsia="Times New Roman" w:hAnsi="Times New Roman"/>
+                <w:b/>
+                <w:bCs/>
+                <w:color w:val="000000"/>
+                <w:sz w:val="26"/>
+                <w:szCs w:val="26"/>
+              </w:rPr>
+              <w:t xml:space="preserve">Thời gian hoàn thành</w:t>
+            </w:r>
+          </w:p>
+        </w:tc>
+        <w:tc>
+          <w:tcPr>
+            <w:tcW w:type="dxa" w:w="1800"/>
+          </w:tcPr>
+          <w:p>
+            <w:pPr>
+              <w:spacing w:line="360" w:lineRule="auto"/>
+              <w:jc w:val="left"/>
+            </w:pPr>
+            <w:r>
+              <w:rPr>
+                <w:rFonts w:ascii="Times New Roman" w:cs="Times New Roman" w:eastAsia="Times New Roman" w:hAnsi="Times New Roman"/>
+                <w:b/>
+                <w:bCs/>
+                <w:color w:val="000000"/>
+                <w:sz w:val="26"/>
+                <w:szCs w:val="26"/>
+              </w:rPr>
+              <w:t xml:space="preserve">Trách nhiệm</w:t>
+            </w:r>
+          </w:p>
+        </w:tc>
+        <w:tc>
+          <w:tcPr>
+            <w:tcW w:type="dxa" w:w="1200"/>
+          </w:tcPr>
+          <w:p>
+            <w:pPr>
+              <w:spacing w:line="360" w:lineRule="auto"/>
+              <w:jc w:val="left"/>
+            </w:pPr>
+            <w:r>
+              <w:rPr>
+                <w:rFonts w:ascii="Times New Roman" w:cs="Times New Roman" w:eastAsia="Times New Roman" w:hAnsi="Times New Roman"/>
+                <w:b/>
+                <w:bCs/>
+                <w:color w:val="000000"/>
+                <w:sz w:val="26"/>
+                <w:szCs w:val="26"/>
+              </w:rPr>
+              <w:t xml:space="preserve">Ghi chú</w:t>
             </w:r>
           </w:p>
         </w:tc>
@@ -1660,7 +1698,29 @@
       <w:tr>
         <w:tc>
           <w:tcPr>
-            <w:tcW w:type="dxa" w:w="600"/>
+            <w:tcW w:type="dxa" w:w="900"/>
+          </w:tcPr>
+          <w:p>
+            <w:pPr>
+              <w:spacing w:line="360" w:lineRule="auto"/>
+              <w:jc w:val="left"/>
+            </w:pPr>
+            <w:r>
+              <w:rPr>
+                <w:rFonts w:ascii="Times New Roman" w:cs="Times New Roman" w:eastAsia="Times New Roman" w:hAnsi="Times New Roman"/>
+                <w:b w:val="false"/>
+                <w:bCs w:val="false"/>
+                <w:color w:val="000000"/>
+                <w:sz w:val="26"/>
+                <w:szCs w:val="26"/>
+              </w:rPr>
+              <w:t xml:space="preserve">{#notAchievedSubcriteria}{code}</w:t>
+            </w:r>
+          </w:p>
+        </w:tc>
+        <w:tc>
+          <w:tcPr>
+            <w:tcW w:type="dxa" w:w="900"/>
           </w:tcPr>
           <w:p>
             <w:pPr>
@@ -1676,29 +1736,29 @@
                 <w:sz w:val="26"/>
                 <w:szCs w:val="26"/>
               </w:rPr>
-              <w:t xml:space="preserve">{#notAchieved}{stt}</w:t>
-            </w:r>
-          </w:p>
-        </w:tc>
-        <w:tc>
-          <w:tcPr>
-            <w:tcW w:type="dxa" w:w="1100"/>
-          </w:tcPr>
-          <w:p>
-            <w:pPr>
-              <w:spacing w:line="360" w:lineRule="auto"/>
-              <w:jc w:val="left"/>
-            </w:pPr>
-            <w:r>
-              <w:rPr>
-                <w:rFonts w:ascii="Times New Roman" w:cs="Times New Roman" w:eastAsia="Times New Roman" w:hAnsi="Times New Roman"/>
-                <w:b w:val="false"/>
-                <w:bCs w:val="false"/>
-                <w:color w:val="000000"/>
-                <w:sz w:val="26"/>
-                <w:szCs w:val="26"/>
-              </w:rPr>
-              <w:t xml:space="preserve">{code}</w:t>
+              <w:t xml:space="preserve">{currentLevel}</w:t>
+            </w:r>
+          </w:p>
+        </w:tc>
+        <w:tc>
+          <w:tcPr>
+            <w:tcW w:type="dxa" w:w="900"/>
+          </w:tcPr>
+          <w:p>
+            <w:pPr>
+              <w:spacing w:line="360" w:lineRule="auto"/>
+              <w:jc w:val="center"/>
+            </w:pPr>
+            <w:r>
+              <w:rPr>
+                <w:rFonts w:ascii="Times New Roman" w:cs="Times New Roman" w:eastAsia="Times New Roman" w:hAnsi="Times New Roman"/>
+                <w:b w:val="false"/>
+                <w:bCs w:val="false"/>
+                <w:color w:val="000000"/>
+                <w:sz w:val="26"/>
+                <w:szCs w:val="26"/>
+              </w:rPr>
+              <w:t xml:space="preserve">{expectedLevel}</w:t>
             </w:r>
           </w:p>
         </w:tc>
@@ -1720,73 +1780,73 @@
                 <w:sz w:val="26"/>
                 <w:szCs w:val="26"/>
               </w:rPr>
-              <w:t xml:space="preserve">{name}</w:t>
-            </w:r>
-          </w:p>
-        </w:tc>
-        <w:tc>
-          <w:tcPr>
-            <w:tcW w:type="dxa" w:w="1000"/>
-          </w:tcPr>
-          <w:p>
-            <w:pPr>
-              <w:spacing w:line="360" w:lineRule="auto"/>
-              <w:jc w:val="center"/>
-            </w:pPr>
-            <w:r>
-              <w:rPr>
-                <w:rFonts w:ascii="Times New Roman" w:cs="Times New Roman" w:eastAsia="Times New Roman" w:hAnsi="Times New Roman"/>
-                <w:b w:val="false"/>
-                <w:bCs w:val="false"/>
-                <w:color w:val="000000"/>
-                <w:sz w:val="26"/>
-                <w:szCs w:val="26"/>
-              </w:rPr>
-              <w:t xml:space="preserve">{currentLevel}</w:t>
-            </w:r>
-          </w:p>
-        </w:tc>
-        <w:tc>
-          <w:tcPr>
-            <w:tcW w:type="dxa" w:w="1000"/>
-          </w:tcPr>
-          <w:p>
-            <w:pPr>
-              <w:spacing w:line="360" w:lineRule="auto"/>
-              <w:jc w:val="center"/>
-            </w:pPr>
-            <w:r>
-              <w:rPr>
-                <w:rFonts w:ascii="Times New Roman" w:cs="Times New Roman" w:eastAsia="Times New Roman" w:hAnsi="Times New Roman"/>
-                <w:b w:val="false"/>
-                <w:bCs w:val="false"/>
-                <w:color w:val="000000"/>
-                <w:sz w:val="26"/>
-                <w:szCs w:val="26"/>
-              </w:rPr>
-              <w:t xml:space="preserve">{expectedLevel}</w:t>
-            </w:r>
-          </w:p>
-        </w:tc>
-        <w:tc>
-          <w:tcPr>
-            <w:tcW w:type="dxa" w:w="2000"/>
-          </w:tcPr>
-          <w:p>
-            <w:pPr>
-              <w:spacing w:line="360" w:lineRule="auto"/>
-              <w:jc w:val="left"/>
-            </w:pPr>
-            <w:r>
-              <w:rPr>
-                <w:rFonts w:ascii="Times New Roman" w:cs="Times New Roman" w:eastAsia="Times New Roman" w:hAnsi="Times New Roman"/>
-                <w:b w:val="false"/>
-                <w:bCs w:val="false"/>
-                <w:color w:val="000000"/>
-                <w:sz w:val="26"/>
-                <w:szCs w:val="26"/>
-              </w:rPr>
-              <w:t xml:space="preserve">{departmentName}{/notAchieved}</w:t>
+              <w:t xml:space="preserve">{subcriteriaText}</w:t>
+            </w:r>
+          </w:p>
+        </w:tc>
+        <w:tc>
+          <w:tcPr>
+            <w:tcW w:type="dxa" w:w="1200"/>
+          </w:tcPr>
+          <w:p>
+            <w:pPr>
+              <w:spacing w:line="360" w:lineRule="auto"/>
+              <w:jc w:val="left"/>
+            </w:pPr>
+            <w:r>
+              <w:rPr>
+                <w:rFonts w:ascii="Times New Roman" w:cs="Times New Roman" w:eastAsia="Times New Roman" w:hAnsi="Times New Roman"/>
+                <w:b w:val="false"/>
+                <w:bCs w:val="false"/>
+                <w:color w:val="000000"/>
+                <w:sz w:val="26"/>
+                <w:szCs w:val="26"/>
+              </w:rPr>
+              <w:t xml:space="preserve">{completionDate}</w:t>
+            </w:r>
+          </w:p>
+        </w:tc>
+        <w:tc>
+          <w:tcPr>
+            <w:tcW w:type="dxa" w:w="1800"/>
+          </w:tcPr>
+          <w:p>
+            <w:pPr>
+              <w:spacing w:line="360" w:lineRule="auto"/>
+              <w:jc w:val="left"/>
+            </w:pPr>
+            <w:r>
+              <w:rPr>
+                <w:rFonts w:ascii="Times New Roman" w:cs="Times New Roman" w:eastAsia="Times New Roman" w:hAnsi="Times New Roman"/>
+                <w:b w:val="false"/>
+                <w:bCs w:val="false"/>
+                <w:color w:val="000000"/>
+                <w:sz w:val="26"/>
+                <w:szCs w:val="26"/>
+              </w:rPr>
+              <w:t xml:space="preserve">{departmentName}</w:t>
+            </w:r>
+          </w:p>
+        </w:tc>
+        <w:tc>
+          <w:tcPr>
+            <w:tcW w:type="dxa" w:w="1200"/>
+          </w:tcPr>
+          <w:p>
+            <w:pPr>
+              <w:spacing w:line="360" w:lineRule="auto"/>
+              <w:jc w:val="left"/>
+            </w:pPr>
+            <w:r>
+              <w:rPr>
+                <w:rFonts w:ascii="Times New Roman" w:cs="Times New Roman" w:eastAsia="Times New Roman" w:hAnsi="Times New Roman"/>
+                <w:b w:val="false"/>
+                <w:bCs w:val="false"/>
+                <w:color w:val="000000"/>
+                <w:sz w:val="26"/>
+                <w:szCs w:val="26"/>
+              </w:rPr>
+              <w:t xml:space="preserve">{note}{/notAchievedSubcriteria}</w:t>
             </w:r>
           </w:p>
         </w:tc>

</xml_diff>

<commit_message>
refactor: remove section V explanatory note from Word template
Regenerate the report template without the helper paragraph above the subcriteria table.

Co-authored-by: Cursor <cursoragent@cursor.com>
</commit_message>
<xml_diff>
--- a/templates/bao-cao-ctcl.template.docx
+++ b/templates/bao-cao-ctcl.template.docx
@@ -1500,21 +1500,6 @@
           <w:szCs w:val="26"/>
         </w:rPr>
         <w:t xml:space="preserve">V. CÁC TIÊU CHÍ CHƯA ĐẠT KẾ HOẠCH</w:t>
-      </w:r>
-    </w:p>
-    <w:p>
-      <w:pPr>
-        <w:spacing w:line="360" w:lineRule="auto"/>
-        <w:jc w:val="left"/>
-      </w:pPr>
-      <w:r>
-        <w:rPr>
-          <w:rFonts w:ascii="Times New Roman" w:cs="Times New Roman" w:eastAsia="Times New Roman" w:hAnsi="Times New Roman"/>
-          <w:color w:val="000000"/>
-          <w:sz w:val="26"/>
-          <w:szCs w:val="26"/>
-        </w:rPr>
-        <w:t xml:space="preserve">Chi tiết các tiểu mục chưa hoàn thành (cột Ghi chú để trống, người dùng tự nhập).</w:t>
       </w:r>
     </w:p>
     <w:tbl>

</xml_diff>